<commit_message>
paper-ai: correct anonymous DOCX numbered-list layout
</commit_message>
<xml_diff>
--- a/docs/research/contemporary/paper_ai/submission_ai_law/MANUSCRIPT_ANONYMOUS.docx
+++ b/docs/research/contemporary/paper_ai/submission_ai_law/MANUSCRIPT_ANONYMOUS.docx
@@ -312,22 +312,14 @@
     <w:p>
       <w:pPr>
         <w:spacing w:before="0" w:after="40" w:line="250" w:lineRule="auto"/>
-        <w:ind w:left="432" w:hanging="317"/>
+        <w:ind w:left="360" w:hanging="216"/>
       </w:pPr>
       <w:r>
         <w:rPr>
           <w:rFonts w:ascii="Times New Roman" w:hAnsi="Times New Roman" w:eastAsia="Times New Roman"/>
           <w:sz w:val="21"/>
         </w:rPr>
-        <w:t>1.</w:t>
-        <w:tab/>
-      </w:r>
-      <w:r>
-        <w:rPr>
-          <w:rFonts w:ascii="Times New Roman" w:hAnsi="Times New Roman" w:eastAsia="Times New Roman"/>
-          <w:sz w:val="21"/>
-        </w:rPr>
-        <w:t xml:space="preserve">A controlled legal-retrieval result showing that removal of recurring legal wording costs </w:t>
+        <w:t xml:space="preserve">1. A controlled legal-retrieval result showing that removal of recurring legal wording costs </w:t>
       </w:r>
       <w:r>
         <w:rPr>
@@ -348,64 +340,40 @@
     <w:p>
       <w:pPr>
         <w:spacing w:before="0" w:after="40" w:line="250" w:lineRule="auto"/>
-        <w:ind w:left="432" w:hanging="317"/>
+        <w:ind w:left="360" w:hanging="216"/>
       </w:pPr>
       <w:r>
         <w:rPr>
           <w:rFonts w:ascii="Times New Roman" w:hAnsi="Times New Roman" w:eastAsia="Times New Roman"/>
           <w:sz w:val="21"/>
         </w:rPr>
-        <w:t>2.</w:t>
-        <w:tab/>
-      </w:r>
-      <w:r>
-        <w:rPr>
-          <w:rFonts w:ascii="Times New Roman" w:hAnsi="Times New Roman" w:eastAsia="Times New Roman"/>
-          <w:sz w:val="21"/>
-        </w:rPr>
-        <w:t>A decomposition of stale-index loss into the part explained by a smaller frozen index and the residual age effect (§7).</w:t>
+        <w:t>2. A decomposition of stale-index loss into the part explained by a smaller frozen index and the residual age effect (§7).</w:t>
       </w:r>
     </w:p>
     <w:p>
       <w:pPr>
         <w:spacing w:before="0" w:after="40" w:line="250" w:lineRule="auto"/>
-        <w:ind w:left="432" w:hanging="317"/>
+        <w:ind w:left="360" w:hanging="216"/>
       </w:pPr>
       <w:r>
         <w:rPr>
           <w:rFonts w:ascii="Times New Roman" w:hAnsi="Times New Roman" w:eastAsia="Times New Roman"/>
           <w:sz w:val="21"/>
         </w:rPr>
-        <w:t>3.</w:t>
-        <w:tab/>
-      </w:r>
-      <w:r>
-        <w:rPr>
-          <w:rFonts w:ascii="Times New Roman" w:hAnsi="Times New Roman" w:eastAsia="Times New Roman"/>
-          <w:sz w:val="21"/>
-        </w:rPr>
-        <w:t>A measurement of what the removed material actually is — its unit, its volume, and what it does to authority support (§4) — which is what makes the intervention worth testing at all.</w:t>
+        <w:t>3. A measurement of what the removed material actually is — its unit, its volume, and what it does to authority support (§4) — which is what makes the intervention worth testing at all.</w:t>
       </w:r>
     </w:p>
     <w:p>
       <w:pPr>
         <w:spacing w:before="0" w:after="40" w:line="250" w:lineRule="auto"/>
-        <w:ind w:left="432" w:hanging="317"/>
+        <w:ind w:left="360" w:hanging="216"/>
       </w:pPr>
       <w:r>
         <w:rPr>
           <w:rFonts w:ascii="Times New Roman" w:hAnsi="Times New Roman" w:eastAsia="Times New Roman"/>
           <w:sz w:val="21"/>
         </w:rPr>
-        <w:t>4.</w:t>
-        <w:tab/>
-      </w:r>
-      <w:r>
-        <w:rPr>
-          <w:rFonts w:ascii="Times New Roman" w:hAnsi="Times New Roman" w:eastAsia="Times New Roman"/>
-          <w:sz w:val="21"/>
-        </w:rPr>
-        <w:t>A domain-specific validity recommendation follows from those experiments, but the control itself, downstream evaluation of cleaning, the retrieval task, and temporal drift are all prior art (§2).</w:t>
+        <w:t>4. A domain-specific validity recommendation follows from those experiments, but the control itself, downstream evaluation of cleaning, the retrieval task, and temporal drift are all prior art (§2).</w:t>
       </w:r>
     </w:p>
     <w:p>
@@ -3187,43 +3155,27 @@
     <w:p>
       <w:pPr>
         <w:spacing w:before="0" w:after="40" w:line="250" w:lineRule="auto"/>
-        <w:ind w:left="432" w:hanging="317"/>
+        <w:ind w:left="360" w:hanging="216"/>
       </w:pPr>
       <w:r>
         <w:rPr>
           <w:rFonts w:ascii="Times New Roman" w:hAnsi="Times New Roman" w:eastAsia="Times New Roman"/>
           <w:sz w:val="21"/>
         </w:rPr>
-        <w:t>1.</w:t>
-        <w:tab/>
-      </w:r>
-      <w:r>
-        <w:rPr>
-          <w:rFonts w:ascii="Times New Roman" w:hAnsi="Times New Roman" w:eastAsia="Times New Roman"/>
-          <w:sz w:val="21"/>
-        </w:rPr>
-        <w:t>The query window ends where the citation begins, so the answer is never inside its own query.</w:t>
+        <w:t>1. The query window ends where the citation begins, so the answer is never inside its own query.</w:t>
       </w:r>
     </w:p>
     <w:p>
       <w:pPr>
         <w:spacing w:before="0" w:after="40" w:line="250" w:lineRule="auto"/>
-        <w:ind w:left="432" w:hanging="317"/>
+        <w:ind w:left="360" w:hanging="216"/>
       </w:pPr>
       <w:r>
         <w:rPr>
           <w:rFonts w:ascii="Times New Roman" w:hAnsi="Times New Roman" w:eastAsia="Times New Roman"/>
           <w:sz w:val="21"/>
         </w:rPr>
-        <w:t>2.</w:t>
-        <w:tab/>
-      </w:r>
-      <w:r>
-        <w:rPr>
-          <w:rFonts w:ascii="Times New Roman" w:hAnsi="Times New Roman" w:eastAsia="Times New Roman"/>
-          <w:sz w:val="21"/>
-        </w:rPr>
-        <w:t xml:space="preserve">Every statutory citation span </w:t>
+        <w:t xml:space="preserve">2. Every statutory citation span </w:t>
       </w:r>
       <w:r>
         <w:rPr>
@@ -3244,64 +3196,40 @@
     <w:p>
       <w:pPr>
         <w:spacing w:before="0" w:after="40" w:line="250" w:lineRule="auto"/>
-        <w:ind w:left="432" w:hanging="317"/>
+        <w:ind w:left="360" w:hanging="216"/>
       </w:pPr>
       <w:r>
         <w:rPr>
           <w:rFonts w:ascii="Times New Roman" w:hAnsi="Times New Roman" w:eastAsia="Times New Roman"/>
           <w:sz w:val="21"/>
         </w:rPr>
-        <w:t>3.</w:t>
-        <w:tab/>
-      </w:r>
-      <w:r>
-        <w:rPr>
-          <w:rFonts w:ascii="Times New Roman" w:hAnsi="Times New Roman" w:eastAsia="Times New Roman"/>
-          <w:sz w:val="21"/>
-        </w:rPr>
-        <w:t>The window is clipped to its segment: a citation in the reasons never reads the recital.</w:t>
+        <w:t>3. The window is clipped to its segment: a citation in the reasons never reads the recital.</w:t>
       </w:r>
     </w:p>
     <w:p>
       <w:pPr>
         <w:spacing w:before="0" w:after="40" w:line="250" w:lineRule="auto"/>
-        <w:ind w:left="432" w:hanging="317"/>
+        <w:ind w:left="360" w:hanging="216"/>
       </w:pPr>
       <w:r>
         <w:rPr>
           <w:rFonts w:ascii="Times New Roman" w:hAnsi="Times New Roman" w:eastAsia="Times New Roman"/>
           <w:sz w:val="21"/>
         </w:rPr>
-        <w:t>4.</w:t>
-        <w:tab/>
-      </w:r>
-      <w:r>
-        <w:rPr>
-          <w:rFonts w:ascii="Times New Roman" w:hAnsi="Times New Roman" w:eastAsia="Times New Roman"/>
-          <w:sz w:val="21"/>
-        </w:rPr>
-        <w:t>The split is temporal. The index holds strictly earlier quarters, so a query's own judgment can never be in the index.</w:t>
+        <w:t>4. The split is temporal. The index holds strictly earlier quarters, so a query's own judgment can never be in the index.</w:t>
       </w:r>
     </w:p>
     <w:p>
       <w:pPr>
         <w:spacing w:before="0" w:after="40" w:line="250" w:lineRule="auto"/>
-        <w:ind w:left="432" w:hanging="317"/>
+        <w:ind w:left="360" w:hanging="216"/>
       </w:pPr>
       <w:r>
         <w:rPr>
           <w:rFonts w:ascii="Times New Roman" w:hAnsi="Times New Roman" w:eastAsia="Times New Roman"/>
           <w:sz w:val="21"/>
         </w:rPr>
-        <w:t>5.</w:t>
-        <w:tab/>
-      </w:r>
-      <w:r>
-        <w:rPr>
-          <w:rFonts w:ascii="Times New Roman" w:hAnsi="Times New Roman" w:eastAsia="Times New Roman"/>
-          <w:sz w:val="21"/>
-        </w:rPr>
-        <w:t xml:space="preserve">Circulating formulas are recomputed </w:t>
+        <w:t xml:space="preserve">5. Circulating formulas are recomputed </w:t>
       </w:r>
       <w:r>
         <w:rPr>
@@ -3322,15 +3250,14 @@
     <w:p>
       <w:pPr>
         <w:spacing w:before="0" w:after="40" w:line="250" w:lineRule="auto"/>
-        <w:ind w:left="432" w:hanging="317"/>
+        <w:ind w:left="360" w:hanging="216"/>
       </w:pPr>
       <w:r>
         <w:rPr>
           <w:rFonts w:ascii="Times New Roman" w:hAnsi="Times New Roman" w:eastAsia="Times New Roman"/>
           <w:sz w:val="21"/>
         </w:rPr>
-        <w:t>6.</w:t>
-        <w:tab/>
+        <w:t xml:space="preserve">6. </w:t>
       </w:r>
       <w:r>
         <w:rPr>

</xml_diff>